<commit_message>
adding a test line
</commit_message>
<xml_diff>
--- a/Project_Topic_Document_scuba_dive.docx
+++ b/Project_Topic_Document_scuba_dive.docx
@@ -1,10 +1,10 @@
 
 <file path=word/document.xml><?xml version="1.0" encoding="utf-8"?>
-<w:document xmlns:wpc="http://schemas.microsoft.com/office/word/2010/wordprocessingCanvas" xmlns:cx="http://schemas.microsoft.com/office/drawing/2014/chartex" xmlns:cx1="http://schemas.microsoft.com/office/drawing/2015/9/8/chartex" xmlns:cx2="http://schemas.microsoft.com/office/drawing/2015/10/21/chartex" xmlns:cx3="http://schemas.microsoft.com/office/drawing/2016/5/9/chartex" xmlns:cx4="http://schemas.microsoft.com/office/drawing/2016/5/10/chartex" xmlns:cx5="http://schemas.microsoft.com/office/drawing/2016/5/11/chartex" xmlns:cx6="http://schemas.microsoft.com/office/drawing/2016/5/12/chartex" xmlns:cx7="http://schemas.microsoft.com/office/drawing/2016/5/13/chartex" xmlns:cx8="http://schemas.microsoft.com/office/drawing/2016/5/14/chartex" xmlns:mc="http://schemas.openxmlformats.org/markup-compatibility/2006" xmlns:aink="http://schemas.microsoft.com/office/drawing/2016/ink" xmlns:am3d="http://schemas.microsoft.com/office/drawing/2017/model3d" xmlns:o="urn:schemas-microsoft-com:office:office" xmlns:oel="http://schemas.microsoft.com/office/2019/extlst" xmlns:r="http://schemas.openxmlformats.org/officeDocument/2006/relationships" xmlns:m="http://schemas.openxmlformats.org/officeDocument/2006/math" xmlns:v="urn:schemas-microsoft-com:vml" xmlns:wp14="http://schemas.microsoft.com/office/word/2010/wordprocessingDrawing" xmlns:wp="http://schemas.openxmlformats.org/drawingml/2006/wordprocessingDrawing" xmlns:w10="urn:schemas-microsoft-com:office:word" xmlns:w="http://schemas.openxmlformats.org/wordprocessingml/2006/main" xmlns:w14="http://schemas.microsoft.com/office/word/2010/wordml" xmlns:w15="http://schemas.microsoft.com/office/word/2012/wordml" xmlns:w16cei="http://schemas.microsoft.com/office/word/2026/wordml/cei" xmlns:w16cex="http://schemas.microsoft.com/office/word/2018/wordml/cex" xmlns:w16cid="http://schemas.microsoft.com/office/word/2016/wordml/cid" xmlns:w16="http://schemas.microsoft.com/office/word/2018/wordml" xmlns:w16du="http://schemas.microsoft.com/office/word/2023/wordml/word16du" xmlns:w16sdtdh="http://schemas.microsoft.com/office/word/2020/wordml/sdtdatahash" xmlns:w16sdtfl="http://schemas.microsoft.com/office/word/2024/wordml/sdtformatlock" xmlns:w16se="http://schemas.microsoft.com/office/word/2015/wordml/symex" xmlns:wpg="http://schemas.microsoft.com/office/word/2010/wordprocessingGroup" xmlns:wpi="http://schemas.microsoft.com/office/word/2010/wordprocessingInk" xmlns:wne="http://schemas.microsoft.com/office/word/2006/wordml" xmlns:wps="http://schemas.microsoft.com/office/word/2010/wordprocessingShape" mc:Ignorable="w14 w15 w16se w16cid w16 w16cex w16sdtdh w16sdtfl w16du wp14">
+<w:document xmlns:wpc="http://schemas.microsoft.com/office/word/2010/wordprocessingCanvas" xmlns:cx="http://schemas.microsoft.com/office/drawing/2014/chartex" xmlns:cx1="http://schemas.microsoft.com/office/drawing/2015/9/8/chartex" xmlns:cx2="http://schemas.microsoft.com/office/drawing/2015/10/21/chartex" xmlns:cx3="http://schemas.microsoft.com/office/drawing/2016/5/9/chartex" xmlns:cx4="http://schemas.microsoft.com/office/drawing/2016/5/10/chartex" xmlns:cx5="http://schemas.microsoft.com/office/drawing/2016/5/11/chartex" xmlns:cx6="http://schemas.microsoft.com/office/drawing/2016/5/12/chartex" xmlns:cx7="http://schemas.microsoft.com/office/drawing/2016/5/13/chartex" xmlns:cx8="http://schemas.microsoft.com/office/drawing/2016/5/14/chartex" xmlns:mc="http://schemas.openxmlformats.org/markup-compatibility/2006" xmlns:aink="http://schemas.microsoft.com/office/drawing/2016/ink" xmlns:am3d="http://schemas.microsoft.com/office/drawing/2017/model3d" xmlns:o="urn:schemas-microsoft-com:office:office" xmlns:oel="http://schemas.microsoft.com/office/2019/extlst" xmlns:r="http://schemas.openxmlformats.org/officeDocument/2006/relationships" xmlns:m="http://schemas.openxmlformats.org/officeDocument/2006/math" xmlns:v="urn:schemas-microsoft-com:vml" xmlns:wp14="http://schemas.microsoft.com/office/word/2010/wordprocessingDrawing" xmlns:wp="http://schemas.openxmlformats.org/drawingml/2006/wordprocessingDrawing" xmlns:w10="urn:schemas-microsoft-com:office:word" xmlns:w="http://schemas.openxmlformats.org/wordprocessingml/2006/main" xmlns:w14="http://schemas.microsoft.com/office/word/2010/wordml" xmlns:w15="http://schemas.microsoft.com/office/word/2012/wordml" xmlns:w16cex="http://schemas.microsoft.com/office/word/2018/wordml/cex" xmlns:w16cid="http://schemas.microsoft.com/office/word/2016/wordml/cid" xmlns:w16="http://schemas.microsoft.com/office/word/2018/wordml" xmlns:w16du="http://schemas.microsoft.com/office/word/2023/wordml/word16du" xmlns:w16sdtdh="http://schemas.microsoft.com/office/word/2020/wordml/sdtdatahash" xmlns:w16sdtfl="http://schemas.microsoft.com/office/word/2024/wordml/sdtformatlock" xmlns:w16se="http://schemas.microsoft.com/office/word/2015/wordml/symex" xmlns:wpg="http://schemas.microsoft.com/office/word/2010/wordprocessingGroup" xmlns:wpi="http://schemas.microsoft.com/office/word/2010/wordprocessingInk" xmlns:wne="http://schemas.microsoft.com/office/word/2006/wordml" xmlns:wps="http://schemas.microsoft.com/office/word/2010/wordprocessingShape" mc:Ignorable="w14 w15 w16se w16cid w16 w16cex w16sdtdh w16sdtfl w16du wp14">
   <w:body>
     <w:p>
       <w:pPr>
-        <w:pStyle w:val="Title"/>
+        <w:pStyle w:val="a3"/>
       </w:pPr>
       <w:r>
         <w:t>CIS2232 / CIS2250 Business Topic</w:t>
@@ -73,15 +73,7 @@
         <w:t xml:space="preserve"> </w:t>
       </w:r>
       <w:r>
-        <w:t xml:space="preserve">It can be </w:t>
-      </w:r>
-      <w:proofErr w:type="gramStart"/>
-      <w:r>
-        <w:t>anything really</w:t>
-      </w:r>
-      <w:proofErr w:type="gramEnd"/>
-      <w:r>
-        <w:t xml:space="preserve"> but something that would take some manipulation / calculations based on the input fields.  </w:t>
+        <w:t xml:space="preserve">It can be anything really but something that would take some manipulation / calculations based on the input fields.  </w:t>
       </w:r>
       <w:r>
         <w:t>You may make up some details to allow calculation</w:t>
@@ -100,21 +92,21 @@
     </w:p>
     <w:p>
       <w:pPr>
-        <w:pStyle w:val="Heading1"/>
+        <w:pStyle w:val="1"/>
       </w:pPr>
       <w:r>
         <w:t xml:space="preserve">Project </w:t>
       </w:r>
       <w:r>
         <w:rPr>
-          <w:rStyle w:val="Heading1Char"/>
+          <w:rStyle w:val="10"/>
         </w:rPr>
         <w:t>Group</w:t>
       </w:r>
     </w:p>
     <w:tbl>
       <w:tblPr>
-        <w:tblStyle w:val="TableGrid"/>
+        <w:tblStyle w:val="af"/>
         <w:tblW w:w="0" w:type="auto"/>
         <w:tblLook w:val="04A0" w:firstRow="1" w:lastRow="0" w:firstColumn="1" w:lastColumn="0" w:noHBand="0" w:noVBand="1"/>
       </w:tblPr>
@@ -180,21 +172,21 @@
     <w:p/>
     <w:p>
       <w:pPr>
-        <w:pStyle w:val="Heading1"/>
+        <w:pStyle w:val="1"/>
       </w:pPr>
       <w:r>
         <w:t xml:space="preserve">Project </w:t>
       </w:r>
       <w:r>
         <w:rPr>
-          <w:rStyle w:val="Heading1Char"/>
+          <w:rStyle w:val="10"/>
         </w:rPr>
         <w:t>Title</w:t>
       </w:r>
     </w:p>
     <w:tbl>
       <w:tblPr>
-        <w:tblStyle w:val="TableGrid"/>
+        <w:tblStyle w:val="af"/>
         <w:tblW w:w="0" w:type="auto"/>
         <w:tblLook w:val="04A0" w:firstRow="1" w:lastRow="0" w:firstColumn="1" w:lastColumn="0" w:noHBand="0" w:noVBand="1"/>
       </w:tblPr>
@@ -218,21 +210,21 @@
     <w:p/>
     <w:p>
       <w:pPr>
-        <w:pStyle w:val="Heading1"/>
+        <w:pStyle w:val="1"/>
       </w:pPr>
       <w:r>
         <w:t xml:space="preserve">Project </w:t>
       </w:r>
       <w:r>
         <w:rPr>
-          <w:rStyle w:val="Heading1Char"/>
+          <w:rStyle w:val="10"/>
         </w:rPr>
         <w:t>Base Color</w:t>
       </w:r>
     </w:p>
     <w:tbl>
       <w:tblPr>
-        <w:tblStyle w:val="TableGrid"/>
+        <w:tblStyle w:val="af"/>
         <w:tblW w:w="0" w:type="auto"/>
         <w:tblLook w:val="04A0" w:firstRow="1" w:lastRow="0" w:firstColumn="1" w:lastColumn="0" w:noHBand="0" w:noVBand="1"/>
       </w:tblPr>
@@ -246,15 +238,7 @@
           </w:tcPr>
           <w:p>
             <w:r>
-              <w:t xml:space="preserve">Ocean Navy </w:t>
-            </w:r>
-            <w:proofErr w:type="gramStart"/>
-            <w:r>
-              <w:t>Blue (#</w:t>
-            </w:r>
-            <w:proofErr w:type="gramEnd"/>
-            <w:r>
-              <w:t>003366)</w:t>
+              <w:t>Ocean Navy Blue (#003366)</w:t>
             </w:r>
           </w:p>
           <w:p/>
@@ -264,7 +248,7 @@
     <w:p/>
     <w:p>
       <w:pPr>
-        <w:pStyle w:val="Heading1"/>
+        <w:pStyle w:val="1"/>
       </w:pPr>
       <w:r>
         <w:t>Description (300 words)</w:t>
@@ -272,7 +256,7 @@
     </w:p>
     <w:tbl>
       <w:tblPr>
-        <w:tblStyle w:val="TableGrid"/>
+        <w:tblStyle w:val="af"/>
         <w:tblW w:w="0" w:type="auto"/>
         <w:tblLook w:val="04A0" w:firstRow="1" w:lastRow="0" w:firstColumn="1" w:lastColumn="0" w:noHBand="0" w:noVBand="1"/>
       </w:tblPr>
@@ -287,15 +271,7 @@
           <w:p/>
           <w:p>
             <w:r>
-              <w:t xml:space="preserve">This application serves recreational scuba divers and dive shops by providing a safety-focused </w:t>
-            </w:r>
-            <w:proofErr w:type="gramStart"/>
-            <w:r>
-              <w:t>dive</w:t>
-            </w:r>
-            <w:proofErr w:type="gramEnd"/>
-            <w:r>
-              <w:t xml:space="preserve"> planning and air consumption estimation system. Scuba diving safety relies heavily on </w:t>
+              <w:t xml:space="preserve">This application serves recreational scuba divers and dive shops by providing a safety-focused dive planning and air consumption estimation system. Scuba diving safety relies heavily on </w:t>
             </w:r>
             <w:r>
               <w:lastRenderedPageBreak/>
@@ -323,7 +299,7 @@
     </w:tbl>
     <w:p>
       <w:pPr>
-        <w:pStyle w:val="Heading1"/>
+        <w:pStyle w:val="1"/>
       </w:pPr>
       <w:r>
         <w:lastRenderedPageBreak/>
@@ -332,7 +308,7 @@
     </w:p>
     <w:tbl>
       <w:tblPr>
-        <w:tblStyle w:val="TableGrid"/>
+        <w:tblStyle w:val="af"/>
         <w:tblW w:w="0" w:type="auto"/>
         <w:tblLook w:val="04A0" w:firstRow="1" w:lastRow="0" w:firstColumn="1" w:lastColumn="0" w:noHBand="0" w:noVBand="1"/>
       </w:tblPr>
@@ -382,11 +358,9 @@
             <w:tcW w:w="2358" w:type="dxa"/>
           </w:tcPr>
           <w:p>
-            <w:proofErr w:type="spellStart"/>
             <w:r>
               <w:t>diverName</w:t>
             </w:r>
-            <w:proofErr w:type="spellEnd"/>
           </w:p>
         </w:tc>
         <w:tc>
@@ -416,11 +390,9 @@
             <w:tcW w:w="2358" w:type="dxa"/>
           </w:tcPr>
           <w:p>
-            <w:proofErr w:type="spellStart"/>
             <w:r>
               <w:t>heightCm</w:t>
             </w:r>
-            <w:proofErr w:type="spellEnd"/>
           </w:p>
         </w:tc>
         <w:tc>
@@ -450,11 +422,9 @@
             <w:tcW w:w="2358" w:type="dxa"/>
           </w:tcPr>
           <w:p>
-            <w:proofErr w:type="spellStart"/>
             <w:r>
               <w:t>weightKg</w:t>
             </w:r>
-            <w:proofErr w:type="spellEnd"/>
           </w:p>
         </w:tc>
         <w:tc>
@@ -516,11 +486,9 @@
             <w:tcW w:w="2358" w:type="dxa"/>
           </w:tcPr>
           <w:p>
-            <w:proofErr w:type="spellStart"/>
             <w:r>
               <w:t>ageGroup</w:t>
             </w:r>
-            <w:proofErr w:type="spellEnd"/>
           </w:p>
         </w:tc>
         <w:tc>
@@ -550,11 +518,9 @@
             <w:tcW w:w="2358" w:type="dxa"/>
           </w:tcPr>
           <w:p>
-            <w:proofErr w:type="spellStart"/>
             <w:r>
               <w:t>targetDepthMeters</w:t>
             </w:r>
-            <w:proofErr w:type="spellEnd"/>
           </w:p>
         </w:tc>
         <w:tc>
@@ -584,11 +550,9 @@
             <w:tcW w:w="2358" w:type="dxa"/>
           </w:tcPr>
           <w:p>
-            <w:proofErr w:type="spellStart"/>
             <w:r>
               <w:t>plannedTimeMinutes</w:t>
             </w:r>
-            <w:proofErr w:type="spellEnd"/>
           </w:p>
         </w:tc>
         <w:tc>
@@ -618,11 +582,9 @@
             <w:tcW w:w="2358" w:type="dxa"/>
           </w:tcPr>
           <w:p>
-            <w:proofErr w:type="spellStart"/>
             <w:r>
               <w:t>diveScenario</w:t>
             </w:r>
-            <w:proofErr w:type="spellEnd"/>
           </w:p>
         </w:tc>
         <w:tc>
@@ -669,7 +631,7 @@
     </w:tbl>
     <w:p>
       <w:pPr>
-        <w:pStyle w:val="Heading1"/>
+        <w:pStyle w:val="1"/>
       </w:pPr>
       <w:r>
         <w:t>Calculation</w:t>
@@ -677,7 +639,7 @@
     </w:p>
     <w:tbl>
       <w:tblPr>
-        <w:tblStyle w:val="TableGrid"/>
+        <w:tblStyle w:val="af"/>
         <w:tblW w:w="0" w:type="auto"/>
         <w:tblLook w:val="04A0" w:firstRow="1" w:lastRow="0" w:firstColumn="1" w:lastColumn="0" w:noHBand="0" w:noVBand="1"/>
       </w:tblPr>
@@ -728,7 +690,6 @@
               </w:numPr>
               <w:spacing w:line="480" w:lineRule="auto"/>
             </w:pPr>
-            <w:proofErr w:type="spellStart"/>
             <m:oMath>
               <m:r>
                 <m:rPr>
@@ -736,7 +697,6 @@
                 </m:rPr>
                 <m:t>bsa</m:t>
               </m:r>
-              <w:proofErr w:type="spellEnd"/>
               <m:r>
                 <w:rPr>
                   <w:rFonts w:ascii="Cambria Math" w:hAnsi="Cambria Math"/>
@@ -767,14 +727,12 @@
                       </m:ctrlPr>
                     </m:dPr>
                     <m:e>
-                      <w:proofErr w:type="spellStart"/>
                       <m:r>
                         <m:rPr>
                           <m:nor/>
                         </m:rPr>
                         <m:t>heightCm</m:t>
                       </m:r>
-                      <w:proofErr w:type="spellEnd"/>
                       <m:r>
                         <w:rPr>
                           <w:rFonts w:ascii="Cambria Math" w:hAnsi="Cambria Math"/>
@@ -817,7 +775,6 @@
               </w:numPr>
               <w:spacing w:line="480" w:lineRule="auto"/>
             </w:pPr>
-            <w:proofErr w:type="spellStart"/>
             <m:oMath>
               <m:r>
                 <m:rPr>
@@ -825,7 +782,6 @@
                 </m:rPr>
                 <m:t>genderFactor</m:t>
               </m:r>
-              <w:proofErr w:type="spellEnd"/>
               <m:r>
                 <w:rPr>
                   <w:rFonts w:ascii="Cambria Math" w:hAnsi="Cambria Math"/>
@@ -877,7 +833,6 @@
               </w:numPr>
               <w:spacing w:line="480" w:lineRule="auto"/>
             </w:pPr>
-            <w:proofErr w:type="spellStart"/>
             <m:oMath>
               <m:r>
                 <m:rPr>
@@ -885,7 +840,6 @@
                 </m:rPr>
                 <m:t>ageMultiplier</m:t>
               </m:r>
-              <w:proofErr w:type="spellEnd"/>
               <m:r>
                 <w:rPr>
                   <w:rFonts w:ascii="Cambria Math" w:hAnsi="Cambria Math"/>
@@ -956,7 +910,6 @@
               </w:numPr>
               <w:spacing w:line="480" w:lineRule="auto"/>
             </w:pPr>
-            <w:proofErr w:type="spellStart"/>
             <m:oMath>
               <m:r>
                 <m:rPr>
@@ -964,7 +917,6 @@
                 </m:rPr>
                 <m:t>baselineSAC</m:t>
               </m:r>
-              <w:proofErr w:type="spellEnd"/>
               <m:r>
                 <w:rPr>
                   <w:rFonts w:ascii="Cambria Math" w:hAnsi="Cambria Math"/>
@@ -1024,7 +976,6 @@
               </w:numPr>
               <w:spacing w:line="480" w:lineRule="auto"/>
             </w:pPr>
-            <w:proofErr w:type="spellStart"/>
             <m:oMath>
               <m:r>
                 <m:rPr>
@@ -1032,7 +983,6 @@
                 </m:rPr>
                 <m:t>ata</m:t>
               </m:r>
-              <w:proofErr w:type="spellEnd"/>
               <m:r>
                 <w:rPr>
                   <w:rFonts w:ascii="Cambria Math" w:hAnsi="Cambria Math"/>
@@ -1078,7 +1028,6 @@
               </w:numPr>
               <w:spacing w:line="480" w:lineRule="auto"/>
             </w:pPr>
-            <w:proofErr w:type="spellStart"/>
             <m:oMath>
               <m:r>
                 <m:rPr>
@@ -1086,7 +1035,6 @@
                 </m:rPr>
                 <m:t>effectiveSAC</m:t>
               </m:r>
-              <w:proofErr w:type="spellEnd"/>
               <m:r>
                 <w:rPr>
                   <w:rFonts w:ascii="Cambria Math" w:hAnsi="Cambria Math"/>
@@ -1121,7 +1069,6 @@
               </w:numPr>
               <w:spacing w:line="480" w:lineRule="auto"/>
             </w:pPr>
-            <w:proofErr w:type="spellStart"/>
             <m:oMath>
               <m:r>
                 <m:rPr>
@@ -1129,7 +1076,6 @@
                 </m:rPr>
                 <m:t>totalAirNeededLiters</m:t>
               </m:r>
-              <w:proofErr w:type="spellEnd"/>
               <m:r>
                 <w:rPr>
                   <w:rFonts w:ascii="Cambria Math" w:hAnsi="Cambria Math"/>
@@ -1200,7 +1146,6 @@
               </w:numPr>
               <w:spacing w:line="480" w:lineRule="auto"/>
             </w:pPr>
-            <w:proofErr w:type="spellStart"/>
             <m:oMath>
               <m:r>
                 <m:rPr>
@@ -1208,7 +1153,6 @@
                 </m:rPr>
                 <m:t>recommendedTankSizeLiters</m:t>
               </m:r>
-              <w:proofErr w:type="spellEnd"/>
               <m:r>
                 <w:rPr>
                   <w:rFonts w:ascii="Cambria Math" w:hAnsi="Cambria Math"/>
@@ -1240,7 +1184,7 @@
     <w:p/>
     <w:p>
       <w:pPr>
-        <w:pStyle w:val="Heading1"/>
+        <w:pStyle w:val="1"/>
       </w:pPr>
       <w:r>
         <w:t>Repository</w:t>
@@ -1248,29 +1192,42 @@
     </w:p>
     <w:p>
       <w:r>
-        <w:t xml:space="preserve">Once the document is completed, move the </w:t>
-      </w:r>
-      <w:proofErr w:type="gramStart"/>
-      <w:r>
-        <w:t>details</w:t>
-      </w:r>
-      <w:proofErr w:type="gramEnd"/>
-      <w:r>
-        <w:t xml:space="preserve"> a repository that you create.  The developer creates the repository for the topic that they will be coding.  Add the other two project group members to the </w:t>
-      </w:r>
-      <w:proofErr w:type="gramStart"/>
-      <w:r>
-        <w:t>repository(</w:t>
-      </w:r>
-      <w:proofErr w:type="gramEnd"/>
-      <w:r>
-        <w:t xml:space="preserve">or make public).  Add this document to the repository (Commit/Push).  </w:t>
+        <w:t xml:space="preserve">Once the document is completed, move the details a repository that you create.  The developer creates the repository for the topic that they will be coding.  Add the other two project group members to the repository(or make public).  Add this document to the repository (Commit/Push).  </w:t>
       </w:r>
       <w:r>
         <w:t>The description is to be added to the readme file of the repository.</w:t>
       </w:r>
     </w:p>
-    <w:p/>
+    <w:p>
+      <w:pPr>
+        <w:rPr>
+          <w:rFonts w:eastAsia="新細明體"/>
+          <w:lang w:eastAsia="zh-TW"/>
+        </w:rPr>
+      </w:pPr>
+    </w:p>
+    <w:p>
+      <w:pPr>
+        <w:rPr>
+          <w:rFonts w:eastAsia="新細明體" w:hint="eastAsia"/>
+          <w:lang w:eastAsia="zh-TW"/>
+        </w:rPr>
+      </w:pPr>
+      <w:r>
+        <w:rPr>
+          <w:rFonts w:eastAsia="新細明體"/>
+          <w:lang w:eastAsia="zh-TW"/>
+        </w:rPr>
+        <w:t>T</w:t>
+      </w:r>
+      <w:r>
+        <w:rPr>
+          <w:rFonts w:eastAsia="新細明體" w:hint="eastAsia"/>
+          <w:lang w:eastAsia="zh-TW"/>
+        </w:rPr>
+        <w:t>est line</w:t>
+      </w:r>
+    </w:p>
     <w:sectPr>
       <w:pgSz w:w="12240" w:h="15840"/>
       <w:pgMar w:top="1440" w:right="1440" w:bottom="1440" w:left="1440" w:header="720" w:footer="720" w:gutter="0"/>
@@ -1282,7 +1239,7 @@
 </file>
 
 <file path=word/numbering.xml><?xml version="1.0" encoding="utf-8"?>
-<w:numbering xmlns:wpc="http://schemas.microsoft.com/office/word/2010/wordprocessingCanvas" xmlns:cx="http://schemas.microsoft.com/office/drawing/2014/chartex" xmlns:cx1="http://schemas.microsoft.com/office/drawing/2015/9/8/chartex" xmlns:cx2="http://schemas.microsoft.com/office/drawing/2015/10/21/chartex" xmlns:cx3="http://schemas.microsoft.com/office/drawing/2016/5/9/chartex" xmlns:cx4="http://schemas.microsoft.com/office/drawing/2016/5/10/chartex" xmlns:cx5="http://schemas.microsoft.com/office/drawing/2016/5/11/chartex" xmlns:cx6="http://schemas.microsoft.com/office/drawing/2016/5/12/chartex" xmlns:cx7="http://schemas.microsoft.com/office/drawing/2016/5/13/chartex" xmlns:cx8="http://schemas.microsoft.com/office/drawing/2016/5/14/chartex" xmlns:mc="http://schemas.openxmlformats.org/markup-compatibility/2006" xmlns:aink="http://schemas.microsoft.com/office/drawing/2016/ink" xmlns:am3d="http://schemas.microsoft.com/office/drawing/2017/model3d" xmlns:o="urn:schemas-microsoft-com:office:office" xmlns:oel="http://schemas.microsoft.com/office/2019/extlst" xmlns:r="http://schemas.openxmlformats.org/officeDocument/2006/relationships" xmlns:m="http://schemas.openxmlformats.org/officeDocument/2006/math" xmlns:v="urn:schemas-microsoft-com:vml" xmlns:wp14="http://schemas.microsoft.com/office/word/2010/wordprocessingDrawing" xmlns:wp="http://schemas.openxmlformats.org/drawingml/2006/wordprocessingDrawing" xmlns:w10="urn:schemas-microsoft-com:office:word" xmlns:w="http://schemas.openxmlformats.org/wordprocessingml/2006/main" xmlns:w14="http://schemas.microsoft.com/office/word/2010/wordml" xmlns:w15="http://schemas.microsoft.com/office/word/2012/wordml" xmlns:w16cei="http://schemas.microsoft.com/office/word/2026/wordml/cei" xmlns:w16cex="http://schemas.microsoft.com/office/word/2018/wordml/cex" xmlns:w16cid="http://schemas.microsoft.com/office/word/2016/wordml/cid" xmlns:w16="http://schemas.microsoft.com/office/word/2018/wordml" xmlns:w16du="http://schemas.microsoft.com/office/word/2023/wordml/word16du" xmlns:w16sdtdh="http://schemas.microsoft.com/office/word/2020/wordml/sdtdatahash" xmlns:w16sdtfl="http://schemas.microsoft.com/office/word/2024/wordml/sdtformatlock" xmlns:w16se="http://schemas.microsoft.com/office/word/2015/wordml/symex" xmlns:wpg="http://schemas.microsoft.com/office/word/2010/wordprocessingGroup" xmlns:wpi="http://schemas.microsoft.com/office/word/2010/wordprocessingInk" xmlns:wne="http://schemas.microsoft.com/office/word/2006/wordml" xmlns:wps="http://schemas.microsoft.com/office/word/2010/wordprocessingShape" mc:Ignorable="w14 w15 w16se w16cid w16 w16cex w16sdtdh w16sdtfl w16du wp14">
+<w:numbering xmlns:wpc="http://schemas.microsoft.com/office/word/2010/wordprocessingCanvas" xmlns:cx="http://schemas.microsoft.com/office/drawing/2014/chartex" xmlns:cx1="http://schemas.microsoft.com/office/drawing/2015/9/8/chartex" xmlns:cx2="http://schemas.microsoft.com/office/drawing/2015/10/21/chartex" xmlns:cx3="http://schemas.microsoft.com/office/drawing/2016/5/9/chartex" xmlns:cx4="http://schemas.microsoft.com/office/drawing/2016/5/10/chartex" xmlns:cx5="http://schemas.microsoft.com/office/drawing/2016/5/11/chartex" xmlns:cx6="http://schemas.microsoft.com/office/drawing/2016/5/12/chartex" xmlns:cx7="http://schemas.microsoft.com/office/drawing/2016/5/13/chartex" xmlns:cx8="http://schemas.microsoft.com/office/drawing/2016/5/14/chartex" xmlns:mc="http://schemas.openxmlformats.org/markup-compatibility/2006" xmlns:aink="http://schemas.microsoft.com/office/drawing/2016/ink" xmlns:am3d="http://schemas.microsoft.com/office/drawing/2017/model3d" xmlns:o="urn:schemas-microsoft-com:office:office" xmlns:oel="http://schemas.microsoft.com/office/2019/extlst" xmlns:r="http://schemas.openxmlformats.org/officeDocument/2006/relationships" xmlns:m="http://schemas.openxmlformats.org/officeDocument/2006/math" xmlns:v="urn:schemas-microsoft-com:vml" xmlns:wp14="http://schemas.microsoft.com/office/word/2010/wordprocessingDrawing" xmlns:wp="http://schemas.openxmlformats.org/drawingml/2006/wordprocessingDrawing" xmlns:w10="urn:schemas-microsoft-com:office:word" xmlns:w="http://schemas.openxmlformats.org/wordprocessingml/2006/main" xmlns:w14="http://schemas.microsoft.com/office/word/2010/wordml" xmlns:w15="http://schemas.microsoft.com/office/word/2012/wordml" xmlns:w16cex="http://schemas.microsoft.com/office/word/2018/wordml/cex" xmlns:w16cid="http://schemas.microsoft.com/office/word/2016/wordml/cid" xmlns:w16="http://schemas.microsoft.com/office/word/2018/wordml" xmlns:w16du="http://schemas.microsoft.com/office/word/2023/wordml/word16du" xmlns:w16sdtdh="http://schemas.microsoft.com/office/word/2020/wordml/sdtdatahash" xmlns:w16sdtfl="http://schemas.microsoft.com/office/word/2024/wordml/sdtformatlock" xmlns:w16se="http://schemas.microsoft.com/office/word/2015/wordml/symex" xmlns:wpg="http://schemas.microsoft.com/office/word/2010/wordprocessingGroup" xmlns:wpi="http://schemas.microsoft.com/office/word/2010/wordprocessingInk" xmlns:wne="http://schemas.microsoft.com/office/word/2006/wordml" xmlns:wps="http://schemas.microsoft.com/office/word/2010/wordprocessingShape" mc:Ignorable="w14 w15 w16se w16cid w16 w16cex w16sdtdh w16sdtfl w16du wp14">
   <w:abstractNum w:abstractNumId="0" w15:restartNumberingAfterBreak="0">
     <w:nsid w:val="107E5E91"/>
     <w:multiLevelType w:val="multilevel"/>
@@ -2451,15 +2408,15 @@
     <w:lsdException w:name="Unresolved Mention" w:semiHidden="1" w:unhideWhenUsed="1"/>
     <w:lsdException w:name="Smart Link" w:semiHidden="1" w:unhideWhenUsed="1"/>
   </w:latentStyles>
-  <w:style w:type="paragraph" w:default="1" w:styleId="Normal">
+  <w:style w:type="paragraph" w:default="1" w:styleId="a">
     <w:name w:val="Normal"/>
     <w:qFormat/>
   </w:style>
-  <w:style w:type="paragraph" w:styleId="Heading1">
+  <w:style w:type="paragraph" w:styleId="1">
     <w:name w:val="heading 1"/>
-    <w:basedOn w:val="Normal"/>
-    <w:next w:val="Normal"/>
-    <w:link w:val="Heading1Char"/>
+    <w:basedOn w:val="a"/>
+    <w:next w:val="a"/>
+    <w:link w:val="10"/>
     <w:uiPriority w:val="9"/>
     <w:qFormat/>
     <w:rsid w:val="00943740"/>
@@ -2476,11 +2433,11 @@
       <w:szCs w:val="40"/>
     </w:rPr>
   </w:style>
-  <w:style w:type="paragraph" w:styleId="Heading2">
+  <w:style w:type="paragraph" w:styleId="2">
     <w:name w:val="heading 2"/>
-    <w:basedOn w:val="Normal"/>
-    <w:next w:val="Normal"/>
-    <w:link w:val="Heading2Char"/>
+    <w:basedOn w:val="a"/>
+    <w:next w:val="a"/>
+    <w:link w:val="20"/>
     <w:uiPriority w:val="9"/>
     <w:unhideWhenUsed/>
     <w:qFormat/>
@@ -2498,11 +2455,11 @@
       <w:szCs w:val="32"/>
     </w:rPr>
   </w:style>
-  <w:style w:type="paragraph" w:styleId="Heading3">
+  <w:style w:type="paragraph" w:styleId="3">
     <w:name w:val="heading 3"/>
-    <w:basedOn w:val="Normal"/>
-    <w:next w:val="Normal"/>
-    <w:link w:val="Heading3Char"/>
+    <w:basedOn w:val="a"/>
+    <w:next w:val="a"/>
+    <w:link w:val="30"/>
     <w:uiPriority w:val="9"/>
     <w:semiHidden/>
     <w:unhideWhenUsed/>
@@ -2521,11 +2478,11 @@
       <w:szCs w:val="28"/>
     </w:rPr>
   </w:style>
-  <w:style w:type="paragraph" w:styleId="Heading4">
+  <w:style w:type="paragraph" w:styleId="4">
     <w:name w:val="heading 4"/>
-    <w:basedOn w:val="Normal"/>
-    <w:next w:val="Normal"/>
-    <w:link w:val="Heading4Char"/>
+    <w:basedOn w:val="a"/>
+    <w:next w:val="a"/>
+    <w:link w:val="40"/>
     <w:uiPriority w:val="9"/>
     <w:semiHidden/>
     <w:unhideWhenUsed/>
@@ -2544,11 +2501,11 @@
       <w:color w:val="0F4761" w:themeColor="accent1" w:themeShade="BF"/>
     </w:rPr>
   </w:style>
-  <w:style w:type="paragraph" w:styleId="Heading5">
+  <w:style w:type="paragraph" w:styleId="5">
     <w:name w:val="heading 5"/>
-    <w:basedOn w:val="Normal"/>
-    <w:next w:val="Normal"/>
-    <w:link w:val="Heading5Char"/>
+    <w:basedOn w:val="a"/>
+    <w:next w:val="a"/>
+    <w:link w:val="50"/>
     <w:uiPriority w:val="9"/>
     <w:semiHidden/>
     <w:unhideWhenUsed/>
@@ -2565,11 +2522,11 @@
       <w:color w:val="0F4761" w:themeColor="accent1" w:themeShade="BF"/>
     </w:rPr>
   </w:style>
-  <w:style w:type="paragraph" w:styleId="Heading6">
+  <w:style w:type="paragraph" w:styleId="6">
     <w:name w:val="heading 6"/>
-    <w:basedOn w:val="Normal"/>
-    <w:next w:val="Normal"/>
-    <w:link w:val="Heading6Char"/>
+    <w:basedOn w:val="a"/>
+    <w:next w:val="a"/>
+    <w:link w:val="60"/>
     <w:uiPriority w:val="9"/>
     <w:semiHidden/>
     <w:unhideWhenUsed/>
@@ -2588,11 +2545,11 @@
       <w:color w:val="595959" w:themeColor="text1" w:themeTint="A6"/>
     </w:rPr>
   </w:style>
-  <w:style w:type="paragraph" w:styleId="Heading7">
+  <w:style w:type="paragraph" w:styleId="7">
     <w:name w:val="heading 7"/>
-    <w:basedOn w:val="Normal"/>
-    <w:next w:val="Normal"/>
-    <w:link w:val="Heading7Char"/>
+    <w:basedOn w:val="a"/>
+    <w:next w:val="a"/>
+    <w:link w:val="70"/>
     <w:uiPriority w:val="9"/>
     <w:semiHidden/>
     <w:unhideWhenUsed/>
@@ -2609,11 +2566,11 @@
       <w:color w:val="595959" w:themeColor="text1" w:themeTint="A6"/>
     </w:rPr>
   </w:style>
-  <w:style w:type="paragraph" w:styleId="Heading8">
+  <w:style w:type="paragraph" w:styleId="8">
     <w:name w:val="heading 8"/>
-    <w:basedOn w:val="Normal"/>
-    <w:next w:val="Normal"/>
-    <w:link w:val="Heading8Char"/>
+    <w:basedOn w:val="a"/>
+    <w:next w:val="a"/>
+    <w:link w:val="80"/>
     <w:uiPriority w:val="9"/>
     <w:semiHidden/>
     <w:unhideWhenUsed/>
@@ -2632,11 +2589,11 @@
       <w:color w:val="272727" w:themeColor="text1" w:themeTint="D8"/>
     </w:rPr>
   </w:style>
-  <w:style w:type="paragraph" w:styleId="Heading9">
+  <w:style w:type="paragraph" w:styleId="9">
     <w:name w:val="heading 9"/>
-    <w:basedOn w:val="Normal"/>
-    <w:next w:val="Normal"/>
-    <w:link w:val="Heading9Char"/>
+    <w:basedOn w:val="a"/>
+    <w:next w:val="a"/>
+    <w:link w:val="90"/>
     <w:uiPriority w:val="9"/>
     <w:semiHidden/>
     <w:unhideWhenUsed/>
@@ -2653,13 +2610,13 @@
       <w:color w:val="272727" w:themeColor="text1" w:themeTint="D8"/>
     </w:rPr>
   </w:style>
-  <w:style w:type="character" w:default="1" w:styleId="DefaultParagraphFont">
+  <w:style w:type="character" w:default="1" w:styleId="a0">
     <w:name w:val="Default Paragraph Font"/>
     <w:uiPriority w:val="1"/>
     <w:semiHidden/>
     <w:unhideWhenUsed/>
   </w:style>
-  <w:style w:type="table" w:default="1" w:styleId="TableNormal">
+  <w:style w:type="table" w:default="1" w:styleId="a1">
     <w:name w:val="Normal Table"/>
     <w:uiPriority w:val="99"/>
     <w:semiHidden/>
@@ -2674,16 +2631,16 @@
       </w:tblCellMar>
     </w:tblPr>
   </w:style>
-  <w:style w:type="numbering" w:default="1" w:styleId="NoList">
+  <w:style w:type="numbering" w:default="1" w:styleId="a2">
     <w:name w:val="No List"/>
     <w:uiPriority w:val="99"/>
     <w:semiHidden/>
     <w:unhideWhenUsed/>
   </w:style>
-  <w:style w:type="character" w:customStyle="1" w:styleId="Heading1Char">
-    <w:name w:val="Heading 1 Char"/>
-    <w:basedOn w:val="DefaultParagraphFont"/>
-    <w:link w:val="Heading1"/>
+  <w:style w:type="character" w:customStyle="1" w:styleId="10">
+    <w:name w:val="標題 1 字元"/>
+    <w:basedOn w:val="a0"/>
+    <w:link w:val="1"/>
     <w:uiPriority w:val="9"/>
     <w:rsid w:val="00943740"/>
     <w:rPr>
@@ -2693,10 +2650,10 @@
       <w:szCs w:val="40"/>
     </w:rPr>
   </w:style>
-  <w:style w:type="character" w:customStyle="1" w:styleId="Heading2Char">
-    <w:name w:val="Heading 2 Char"/>
-    <w:basedOn w:val="DefaultParagraphFont"/>
-    <w:link w:val="Heading2"/>
+  <w:style w:type="character" w:customStyle="1" w:styleId="20">
+    <w:name w:val="標題 2 字元"/>
+    <w:basedOn w:val="a0"/>
+    <w:link w:val="2"/>
     <w:uiPriority w:val="9"/>
     <w:rsid w:val="00943740"/>
     <w:rPr>
@@ -2706,10 +2663,10 @@
       <w:szCs w:val="32"/>
     </w:rPr>
   </w:style>
-  <w:style w:type="character" w:customStyle="1" w:styleId="Heading3Char">
-    <w:name w:val="Heading 3 Char"/>
-    <w:basedOn w:val="DefaultParagraphFont"/>
-    <w:link w:val="Heading3"/>
+  <w:style w:type="character" w:customStyle="1" w:styleId="30">
+    <w:name w:val="標題 3 字元"/>
+    <w:basedOn w:val="a0"/>
+    <w:link w:val="3"/>
     <w:uiPriority w:val="9"/>
     <w:semiHidden/>
     <w:rsid w:val="00943740"/>
@@ -2720,10 +2677,10 @@
       <w:szCs w:val="28"/>
     </w:rPr>
   </w:style>
-  <w:style w:type="character" w:customStyle="1" w:styleId="Heading4Char">
-    <w:name w:val="Heading 4 Char"/>
-    <w:basedOn w:val="DefaultParagraphFont"/>
-    <w:link w:val="Heading4"/>
+  <w:style w:type="character" w:customStyle="1" w:styleId="40">
+    <w:name w:val="標題 4 字元"/>
+    <w:basedOn w:val="a0"/>
+    <w:link w:val="4"/>
     <w:uiPriority w:val="9"/>
     <w:semiHidden/>
     <w:rsid w:val="00943740"/>
@@ -2734,10 +2691,10 @@
       <w:color w:val="0F4761" w:themeColor="accent1" w:themeShade="BF"/>
     </w:rPr>
   </w:style>
-  <w:style w:type="character" w:customStyle="1" w:styleId="Heading5Char">
-    <w:name w:val="Heading 5 Char"/>
-    <w:basedOn w:val="DefaultParagraphFont"/>
-    <w:link w:val="Heading5"/>
+  <w:style w:type="character" w:customStyle="1" w:styleId="50">
+    <w:name w:val="標題 5 字元"/>
+    <w:basedOn w:val="a0"/>
+    <w:link w:val="5"/>
     <w:uiPriority w:val="9"/>
     <w:semiHidden/>
     <w:rsid w:val="00943740"/>
@@ -2746,10 +2703,10 @@
       <w:color w:val="0F4761" w:themeColor="accent1" w:themeShade="BF"/>
     </w:rPr>
   </w:style>
-  <w:style w:type="character" w:customStyle="1" w:styleId="Heading6Char">
-    <w:name w:val="Heading 6 Char"/>
-    <w:basedOn w:val="DefaultParagraphFont"/>
-    <w:link w:val="Heading6"/>
+  <w:style w:type="character" w:customStyle="1" w:styleId="60">
+    <w:name w:val="標題 6 字元"/>
+    <w:basedOn w:val="a0"/>
+    <w:link w:val="6"/>
     <w:uiPriority w:val="9"/>
     <w:semiHidden/>
     <w:rsid w:val="00943740"/>
@@ -2760,10 +2717,10 @@
       <w:color w:val="595959" w:themeColor="text1" w:themeTint="A6"/>
     </w:rPr>
   </w:style>
-  <w:style w:type="character" w:customStyle="1" w:styleId="Heading7Char">
-    <w:name w:val="Heading 7 Char"/>
-    <w:basedOn w:val="DefaultParagraphFont"/>
-    <w:link w:val="Heading7"/>
+  <w:style w:type="character" w:customStyle="1" w:styleId="70">
+    <w:name w:val="標題 7 字元"/>
+    <w:basedOn w:val="a0"/>
+    <w:link w:val="7"/>
     <w:uiPriority w:val="9"/>
     <w:semiHidden/>
     <w:rsid w:val="00943740"/>
@@ -2772,10 +2729,10 @@
       <w:color w:val="595959" w:themeColor="text1" w:themeTint="A6"/>
     </w:rPr>
   </w:style>
-  <w:style w:type="character" w:customStyle="1" w:styleId="Heading8Char">
-    <w:name w:val="Heading 8 Char"/>
-    <w:basedOn w:val="DefaultParagraphFont"/>
-    <w:link w:val="Heading8"/>
+  <w:style w:type="character" w:customStyle="1" w:styleId="80">
+    <w:name w:val="標題 8 字元"/>
+    <w:basedOn w:val="a0"/>
+    <w:link w:val="8"/>
     <w:uiPriority w:val="9"/>
     <w:semiHidden/>
     <w:rsid w:val="00943740"/>
@@ -2786,10 +2743,10 @@
       <w:color w:val="272727" w:themeColor="text1" w:themeTint="D8"/>
     </w:rPr>
   </w:style>
-  <w:style w:type="character" w:customStyle="1" w:styleId="Heading9Char">
-    <w:name w:val="Heading 9 Char"/>
-    <w:basedOn w:val="DefaultParagraphFont"/>
-    <w:link w:val="Heading9"/>
+  <w:style w:type="character" w:customStyle="1" w:styleId="90">
+    <w:name w:val="標題 9 字元"/>
+    <w:basedOn w:val="a0"/>
+    <w:link w:val="9"/>
     <w:uiPriority w:val="9"/>
     <w:semiHidden/>
     <w:rsid w:val="00943740"/>
@@ -2798,11 +2755,11 @@
       <w:color w:val="272727" w:themeColor="text1" w:themeTint="D8"/>
     </w:rPr>
   </w:style>
-  <w:style w:type="paragraph" w:styleId="Title">
+  <w:style w:type="paragraph" w:styleId="a3">
     <w:name w:val="Title"/>
-    <w:basedOn w:val="Normal"/>
-    <w:next w:val="Normal"/>
-    <w:link w:val="TitleChar"/>
+    <w:basedOn w:val="a"/>
+    <w:next w:val="a"/>
+    <w:link w:val="a4"/>
     <w:uiPriority w:val="10"/>
     <w:qFormat/>
     <w:rsid w:val="00943740"/>
@@ -2818,10 +2775,10 @@
       <w:szCs w:val="56"/>
     </w:rPr>
   </w:style>
-  <w:style w:type="character" w:customStyle="1" w:styleId="TitleChar">
-    <w:name w:val="Title Char"/>
-    <w:basedOn w:val="DefaultParagraphFont"/>
-    <w:link w:val="Title"/>
+  <w:style w:type="character" w:customStyle="1" w:styleId="a4">
+    <w:name w:val="標題 字元"/>
+    <w:basedOn w:val="a0"/>
+    <w:link w:val="a3"/>
     <w:uiPriority w:val="10"/>
     <w:rsid w:val="00943740"/>
     <w:rPr>
@@ -2832,11 +2789,11 @@
       <w:szCs w:val="56"/>
     </w:rPr>
   </w:style>
-  <w:style w:type="paragraph" w:styleId="Subtitle">
+  <w:style w:type="paragraph" w:styleId="a5">
     <w:name w:val="Subtitle"/>
-    <w:basedOn w:val="Normal"/>
-    <w:next w:val="Normal"/>
-    <w:link w:val="SubtitleChar"/>
+    <w:basedOn w:val="a"/>
+    <w:next w:val="a"/>
+    <w:link w:val="a6"/>
     <w:uiPriority w:val="11"/>
     <w:qFormat/>
     <w:rsid w:val="00943740"/>
@@ -2853,10 +2810,10 @@
       <w:szCs w:val="28"/>
     </w:rPr>
   </w:style>
-  <w:style w:type="character" w:customStyle="1" w:styleId="SubtitleChar">
-    <w:name w:val="Subtitle Char"/>
-    <w:basedOn w:val="DefaultParagraphFont"/>
-    <w:link w:val="Subtitle"/>
+  <w:style w:type="character" w:customStyle="1" w:styleId="a6">
+    <w:name w:val="副標題 字元"/>
+    <w:basedOn w:val="a0"/>
+    <w:link w:val="a5"/>
     <w:uiPriority w:val="11"/>
     <w:rsid w:val="00943740"/>
     <w:rPr>
@@ -2867,11 +2824,11 @@
       <w:szCs w:val="28"/>
     </w:rPr>
   </w:style>
-  <w:style w:type="paragraph" w:styleId="Quote">
+  <w:style w:type="paragraph" w:styleId="a7">
     <w:name w:val="Quote"/>
-    <w:basedOn w:val="Normal"/>
-    <w:next w:val="Normal"/>
-    <w:link w:val="QuoteChar"/>
+    <w:basedOn w:val="a"/>
+    <w:next w:val="a"/>
+    <w:link w:val="a8"/>
     <w:uiPriority w:val="29"/>
     <w:qFormat/>
     <w:rsid w:val="00943740"/>
@@ -2885,10 +2842,10 @@
       <w:color w:val="404040" w:themeColor="text1" w:themeTint="BF"/>
     </w:rPr>
   </w:style>
-  <w:style w:type="character" w:customStyle="1" w:styleId="QuoteChar">
-    <w:name w:val="Quote Char"/>
-    <w:basedOn w:val="DefaultParagraphFont"/>
-    <w:link w:val="Quote"/>
+  <w:style w:type="character" w:customStyle="1" w:styleId="a8">
+    <w:name w:val="引文 字元"/>
+    <w:basedOn w:val="a0"/>
+    <w:link w:val="a7"/>
     <w:uiPriority w:val="29"/>
     <w:rsid w:val="00943740"/>
     <w:rPr>
@@ -2897,9 +2854,9 @@
       <w:color w:val="404040" w:themeColor="text1" w:themeTint="BF"/>
     </w:rPr>
   </w:style>
-  <w:style w:type="paragraph" w:styleId="ListParagraph">
+  <w:style w:type="paragraph" w:styleId="a9">
     <w:name w:val="List Paragraph"/>
-    <w:basedOn w:val="Normal"/>
+    <w:basedOn w:val="a"/>
     <w:uiPriority w:val="34"/>
     <w:qFormat/>
     <w:rsid w:val="00943740"/>
@@ -2908,9 +2865,9 @@
       <w:contextualSpacing/>
     </w:pPr>
   </w:style>
-  <w:style w:type="character" w:styleId="IntenseEmphasis">
+  <w:style w:type="character" w:styleId="aa">
     <w:name w:val="Intense Emphasis"/>
-    <w:basedOn w:val="DefaultParagraphFont"/>
+    <w:basedOn w:val="a0"/>
     <w:uiPriority w:val="21"/>
     <w:qFormat/>
     <w:rsid w:val="00943740"/>
@@ -2920,11 +2877,11 @@
       <w:color w:val="0F4761" w:themeColor="accent1" w:themeShade="BF"/>
     </w:rPr>
   </w:style>
-  <w:style w:type="paragraph" w:styleId="IntenseQuote">
+  <w:style w:type="paragraph" w:styleId="ab">
     <w:name w:val="Intense Quote"/>
-    <w:basedOn w:val="Normal"/>
-    <w:next w:val="Normal"/>
-    <w:link w:val="IntenseQuoteChar"/>
+    <w:basedOn w:val="a"/>
+    <w:next w:val="a"/>
+    <w:link w:val="ac"/>
     <w:uiPriority w:val="30"/>
     <w:qFormat/>
     <w:rsid w:val="00943740"/>
@@ -2943,10 +2900,10 @@
       <w:color w:val="0F4761" w:themeColor="accent1" w:themeShade="BF"/>
     </w:rPr>
   </w:style>
-  <w:style w:type="character" w:customStyle="1" w:styleId="IntenseQuoteChar">
-    <w:name w:val="Intense Quote Char"/>
-    <w:basedOn w:val="DefaultParagraphFont"/>
-    <w:link w:val="IntenseQuote"/>
+  <w:style w:type="character" w:customStyle="1" w:styleId="ac">
+    <w:name w:val="鮮明引文 字元"/>
+    <w:basedOn w:val="a0"/>
+    <w:link w:val="ab"/>
     <w:uiPriority w:val="30"/>
     <w:rsid w:val="00943740"/>
     <w:rPr>
@@ -2955,9 +2912,9 @@
       <w:color w:val="0F4761" w:themeColor="accent1" w:themeShade="BF"/>
     </w:rPr>
   </w:style>
-  <w:style w:type="character" w:styleId="IntenseReference">
+  <w:style w:type="character" w:styleId="ad">
     <w:name w:val="Intense Reference"/>
-    <w:basedOn w:val="DefaultParagraphFont"/>
+    <w:basedOn w:val="a0"/>
     <w:uiPriority w:val="32"/>
     <w:qFormat/>
     <w:rsid w:val="00943740"/>
@@ -2969,9 +2926,9 @@
       <w:spacing w:val="5"/>
     </w:rPr>
   </w:style>
-  <w:style w:type="character" w:styleId="Hyperlink">
+  <w:style w:type="character" w:styleId="ae">
     <w:name w:val="Hyperlink"/>
-    <w:basedOn w:val="DefaultParagraphFont"/>
+    <w:basedOn w:val="a0"/>
     <w:uiPriority w:val="99"/>
     <w:semiHidden/>
     <w:unhideWhenUsed/>
@@ -2981,9 +2938,9 @@
       <w:u w:val="single"/>
     </w:rPr>
   </w:style>
-  <w:style w:type="table" w:styleId="TableGrid">
+  <w:style w:type="table" w:styleId="af">
     <w:name w:val="Table Grid"/>
-    <w:basedOn w:val="TableNormal"/>
+    <w:basedOn w:val="a1"/>
     <w:uiPriority w:val="39"/>
     <w:rsid w:val="00943740"/>
     <w:pPr>

</xml_diff>

<commit_message>
removed a test line
</commit_message>
<xml_diff>
--- a/Project_Topic_Document_scuba_dive.docx
+++ b/Project_Topic_Document_scuba_dive.docx
@@ -73,7 +73,15 @@
         <w:t xml:space="preserve"> </w:t>
       </w:r>
       <w:r>
-        <w:t xml:space="preserve">It can be anything really but something that would take some manipulation / calculations based on the input fields.  </w:t>
+        <w:t xml:space="preserve">It can be </w:t>
+      </w:r>
+      <w:proofErr w:type="gramStart"/>
+      <w:r>
+        <w:t>anything really</w:t>
+      </w:r>
+      <w:proofErr w:type="gramEnd"/>
+      <w:r>
+        <w:t xml:space="preserve"> but something that would take some manipulation / calculations based on the input fields.  </w:t>
       </w:r>
       <w:r>
         <w:t>You may make up some details to allow calculation</w:t>
@@ -238,7 +246,15 @@
           </w:tcPr>
           <w:p>
             <w:r>
-              <w:t>Ocean Navy Blue (#003366)</w:t>
+              <w:t xml:space="preserve">Ocean Navy </w:t>
+            </w:r>
+            <w:proofErr w:type="gramStart"/>
+            <w:r>
+              <w:t>Blue (#</w:t>
+            </w:r>
+            <w:proofErr w:type="gramEnd"/>
+            <w:r>
+              <w:t>003366)</w:t>
             </w:r>
           </w:p>
           <w:p/>
@@ -271,7 +287,15 @@
           <w:p/>
           <w:p>
             <w:r>
-              <w:t xml:space="preserve">This application serves recreational scuba divers and dive shops by providing a safety-focused dive planning and air consumption estimation system. Scuba diving safety relies heavily on </w:t>
+              <w:t xml:space="preserve">This application serves recreational scuba divers and dive shops by providing a safety-focused </w:t>
+            </w:r>
+            <w:proofErr w:type="gramStart"/>
+            <w:r>
+              <w:t>dive</w:t>
+            </w:r>
+            <w:proofErr w:type="gramEnd"/>
+            <w:r>
+              <w:t xml:space="preserve"> planning and air consumption estimation system. Scuba diving safety relies heavily on </w:t>
             </w:r>
             <w:r>
               <w:lastRenderedPageBreak/>
@@ -358,9 +382,11 @@
             <w:tcW w:w="2358" w:type="dxa"/>
           </w:tcPr>
           <w:p>
+            <w:proofErr w:type="spellStart"/>
             <w:r>
               <w:t>diverName</w:t>
             </w:r>
+            <w:proofErr w:type="spellEnd"/>
           </w:p>
         </w:tc>
         <w:tc>
@@ -390,9 +416,11 @@
             <w:tcW w:w="2358" w:type="dxa"/>
           </w:tcPr>
           <w:p>
+            <w:proofErr w:type="spellStart"/>
             <w:r>
               <w:t>heightCm</w:t>
             </w:r>
+            <w:proofErr w:type="spellEnd"/>
           </w:p>
         </w:tc>
         <w:tc>
@@ -422,9 +450,11 @@
             <w:tcW w:w="2358" w:type="dxa"/>
           </w:tcPr>
           <w:p>
+            <w:proofErr w:type="spellStart"/>
             <w:r>
               <w:t>weightKg</w:t>
             </w:r>
+            <w:proofErr w:type="spellEnd"/>
           </w:p>
         </w:tc>
         <w:tc>
@@ -486,9 +516,11 @@
             <w:tcW w:w="2358" w:type="dxa"/>
           </w:tcPr>
           <w:p>
+            <w:proofErr w:type="spellStart"/>
             <w:r>
               <w:t>ageGroup</w:t>
             </w:r>
+            <w:proofErr w:type="spellEnd"/>
           </w:p>
         </w:tc>
         <w:tc>
@@ -518,9 +550,11 @@
             <w:tcW w:w="2358" w:type="dxa"/>
           </w:tcPr>
           <w:p>
+            <w:proofErr w:type="spellStart"/>
             <w:r>
               <w:t>targetDepthMeters</w:t>
             </w:r>
+            <w:proofErr w:type="spellEnd"/>
           </w:p>
         </w:tc>
         <w:tc>
@@ -550,9 +584,11 @@
             <w:tcW w:w="2358" w:type="dxa"/>
           </w:tcPr>
           <w:p>
+            <w:proofErr w:type="spellStart"/>
             <w:r>
               <w:t>plannedTimeMinutes</w:t>
             </w:r>
+            <w:proofErr w:type="spellEnd"/>
           </w:p>
         </w:tc>
         <w:tc>
@@ -582,9 +618,11 @@
             <w:tcW w:w="2358" w:type="dxa"/>
           </w:tcPr>
           <w:p>
+            <w:proofErr w:type="spellStart"/>
             <w:r>
               <w:t>diveScenario</w:t>
             </w:r>
+            <w:proofErr w:type="spellEnd"/>
           </w:p>
         </w:tc>
         <w:tc>
@@ -690,6 +728,7 @@
               </w:numPr>
               <w:spacing w:line="480" w:lineRule="auto"/>
             </w:pPr>
+            <w:proofErr w:type="spellStart"/>
             <m:oMath>
               <m:r>
                 <m:rPr>
@@ -697,6 +736,7 @@
                 </m:rPr>
                 <m:t>bsa</m:t>
               </m:r>
+              <w:proofErr w:type="spellEnd"/>
               <m:r>
                 <w:rPr>
                   <w:rFonts w:ascii="Cambria Math" w:hAnsi="Cambria Math"/>
@@ -727,12 +767,14 @@
                       </m:ctrlPr>
                     </m:dPr>
                     <m:e>
+                      <w:proofErr w:type="spellStart"/>
                       <m:r>
                         <m:rPr>
                           <m:nor/>
                         </m:rPr>
                         <m:t>heightCm</m:t>
                       </m:r>
+                      <w:proofErr w:type="spellEnd"/>
                       <m:r>
                         <w:rPr>
                           <w:rFonts w:ascii="Cambria Math" w:hAnsi="Cambria Math"/>
@@ -775,6 +817,7 @@
               </w:numPr>
               <w:spacing w:line="480" w:lineRule="auto"/>
             </w:pPr>
+            <w:proofErr w:type="spellStart"/>
             <m:oMath>
               <m:r>
                 <m:rPr>
@@ -782,6 +825,7 @@
                 </m:rPr>
                 <m:t>genderFactor</m:t>
               </m:r>
+              <w:proofErr w:type="spellEnd"/>
               <m:r>
                 <w:rPr>
                   <w:rFonts w:ascii="Cambria Math" w:hAnsi="Cambria Math"/>
@@ -833,6 +877,7 @@
               </w:numPr>
               <w:spacing w:line="480" w:lineRule="auto"/>
             </w:pPr>
+            <w:proofErr w:type="spellStart"/>
             <m:oMath>
               <m:r>
                 <m:rPr>
@@ -840,6 +885,7 @@
                 </m:rPr>
                 <m:t>ageMultiplier</m:t>
               </m:r>
+              <w:proofErr w:type="spellEnd"/>
               <m:r>
                 <w:rPr>
                   <w:rFonts w:ascii="Cambria Math" w:hAnsi="Cambria Math"/>
@@ -910,6 +956,7 @@
               </w:numPr>
               <w:spacing w:line="480" w:lineRule="auto"/>
             </w:pPr>
+            <w:proofErr w:type="spellStart"/>
             <m:oMath>
               <m:r>
                 <m:rPr>
@@ -917,6 +964,7 @@
                 </m:rPr>
                 <m:t>baselineSAC</m:t>
               </m:r>
+              <w:proofErr w:type="spellEnd"/>
               <m:r>
                 <w:rPr>
                   <w:rFonts w:ascii="Cambria Math" w:hAnsi="Cambria Math"/>
@@ -976,6 +1024,7 @@
               </w:numPr>
               <w:spacing w:line="480" w:lineRule="auto"/>
             </w:pPr>
+            <w:proofErr w:type="spellStart"/>
             <m:oMath>
               <m:r>
                 <m:rPr>
@@ -983,6 +1032,7 @@
                 </m:rPr>
                 <m:t>ata</m:t>
               </m:r>
+              <w:proofErr w:type="spellEnd"/>
               <m:r>
                 <w:rPr>
                   <w:rFonts w:ascii="Cambria Math" w:hAnsi="Cambria Math"/>
@@ -1028,6 +1078,7 @@
               </w:numPr>
               <w:spacing w:line="480" w:lineRule="auto"/>
             </w:pPr>
+            <w:proofErr w:type="spellStart"/>
             <m:oMath>
               <m:r>
                 <m:rPr>
@@ -1035,6 +1086,7 @@
                 </m:rPr>
                 <m:t>effectiveSAC</m:t>
               </m:r>
+              <w:proofErr w:type="spellEnd"/>
               <m:r>
                 <w:rPr>
                   <w:rFonts w:ascii="Cambria Math" w:hAnsi="Cambria Math"/>
@@ -1069,6 +1121,7 @@
               </w:numPr>
               <w:spacing w:line="480" w:lineRule="auto"/>
             </w:pPr>
+            <w:proofErr w:type="spellStart"/>
             <m:oMath>
               <m:r>
                 <m:rPr>
@@ -1076,6 +1129,7 @@
                 </m:rPr>
                 <m:t>totalAirNeededLiters</m:t>
               </m:r>
+              <w:proofErr w:type="spellEnd"/>
               <m:r>
                 <w:rPr>
                   <w:rFonts w:ascii="Cambria Math" w:hAnsi="Cambria Math"/>
@@ -1146,6 +1200,7 @@
               </w:numPr>
               <w:spacing w:line="480" w:lineRule="auto"/>
             </w:pPr>
+            <w:proofErr w:type="spellStart"/>
             <m:oMath>
               <m:r>
                 <m:rPr>
@@ -1153,6 +1208,7 @@
                 </m:rPr>
                 <m:t>recommendedTankSizeLiters</m:t>
               </m:r>
+              <w:proofErr w:type="spellEnd"/>
               <m:r>
                 <w:rPr>
                   <w:rFonts w:ascii="Cambria Math" w:hAnsi="Cambria Math"/>
@@ -1192,7 +1248,23 @@
     </w:p>
     <w:p>
       <w:r>
-        <w:t xml:space="preserve">Once the document is completed, move the details a repository that you create.  The developer creates the repository for the topic that they will be coding.  Add the other two project group members to the repository(or make public).  Add this document to the repository (Commit/Push).  </w:t>
+        <w:t xml:space="preserve">Once the document is completed, move the </w:t>
+      </w:r>
+      <w:proofErr w:type="gramStart"/>
+      <w:r>
+        <w:t>details</w:t>
+      </w:r>
+      <w:proofErr w:type="gramEnd"/>
+      <w:r>
+        <w:t xml:space="preserve"> a repository that you create.  The developer creates the repository for the topic that they will be coding.  Add the other two project group members to the </w:t>
+      </w:r>
+      <w:proofErr w:type="gramStart"/>
+      <w:r>
+        <w:t>repository(</w:t>
+      </w:r>
+      <w:proofErr w:type="gramEnd"/>
+      <w:r>
+        <w:t xml:space="preserve">or make public).  Add this document to the repository (Commit/Push).  </w:t>
       </w:r>
       <w:r>
         <w:t>The description is to be added to the readme file of the repository.</w:t>
@@ -1205,28 +1277,6 @@
           <w:lang w:eastAsia="zh-TW"/>
         </w:rPr>
       </w:pPr>
-    </w:p>
-    <w:p>
-      <w:pPr>
-        <w:rPr>
-          <w:rFonts w:eastAsia="新細明體" w:hint="eastAsia"/>
-          <w:lang w:eastAsia="zh-TW"/>
-        </w:rPr>
-      </w:pPr>
-      <w:r>
-        <w:rPr>
-          <w:rFonts w:eastAsia="新細明體"/>
-          <w:lang w:eastAsia="zh-TW"/>
-        </w:rPr>
-        <w:t>T</w:t>
-      </w:r>
-      <w:r>
-        <w:rPr>
-          <w:rFonts w:eastAsia="新細明體" w:hint="eastAsia"/>
-          <w:lang w:eastAsia="zh-TW"/>
-        </w:rPr>
-        <w:t>est line</w:t>
-      </w:r>
     </w:p>
     <w:sectPr>
       <w:pgSz w:w="12240" w:h="15840"/>

</xml_diff>

<commit_message>
adding BA / Developer / PM fields
</commit_message>
<xml_diff>
--- a/Project_Topic_Document_scuba_dive.docx
+++ b/Project_Topic_Document_scuba_dive.docx
@@ -73,15 +73,7 @@
         <w:t xml:space="preserve"> </w:t>
       </w:r>
       <w:r>
-        <w:t xml:space="preserve">It can be </w:t>
-      </w:r>
-      <w:proofErr w:type="gramStart"/>
-      <w:r>
-        <w:t>anything really</w:t>
-      </w:r>
-      <w:proofErr w:type="gramEnd"/>
-      <w:r>
-        <w:t xml:space="preserve"> but something that would take some manipulation / calculations based on the input fields.  </w:t>
+        <w:t xml:space="preserve">It can be anything really but something that would take some manipulation / calculations based on the input fields.  </w:t>
       </w:r>
       <w:r>
         <w:t>You may make up some details to allow calculation</w:t>
@@ -137,7 +129,28 @@
           <w:tcPr>
             <w:tcW w:w="6565" w:type="dxa"/>
           </w:tcPr>
-          <w:p/>
+          <w:p>
+            <w:pPr>
+              <w:rPr>
+                <w:rFonts w:eastAsia="新細明體" w:hint="eastAsia"/>
+                <w:lang w:eastAsia="zh-TW"/>
+              </w:rPr>
+            </w:pPr>
+            <w:r>
+              <w:rPr>
+                <w:rFonts w:ascii="新細明體" w:eastAsia="新細明體" w:hAnsi="新細明體" w:hint="eastAsia"/>
+                <w:lang w:eastAsia="zh-TW"/>
+              </w:rPr>
+              <w:t>S</w:t>
+            </w:r>
+            <w:r>
+              <w:rPr>
+                <w:rFonts w:eastAsia="新細明體" w:hint="eastAsia"/>
+                <w:lang w:eastAsia="zh-TW"/>
+              </w:rPr>
+              <w:t>ean</w:t>
+            </w:r>
+          </w:p>
         </w:tc>
       </w:tr>
       <w:tr>
@@ -155,7 +168,21 @@
           <w:tcPr>
             <w:tcW w:w="6565" w:type="dxa"/>
           </w:tcPr>
-          <w:p/>
+          <w:p>
+            <w:pPr>
+              <w:rPr>
+                <w:rFonts w:eastAsia="新細明體" w:hint="eastAsia"/>
+                <w:lang w:eastAsia="zh-TW"/>
+              </w:rPr>
+            </w:pPr>
+            <w:r>
+              <w:rPr>
+                <w:rFonts w:eastAsia="新細明體" w:hint="eastAsia"/>
+                <w:lang w:eastAsia="zh-TW"/>
+              </w:rPr>
+              <w:t>Jonathan</w:t>
+            </w:r>
+          </w:p>
         </w:tc>
       </w:tr>
       <w:tr>
@@ -173,7 +200,21 @@
           <w:tcPr>
             <w:tcW w:w="6565" w:type="dxa"/>
           </w:tcPr>
-          <w:p/>
+          <w:p>
+            <w:pPr>
+              <w:rPr>
+                <w:rFonts w:eastAsia="新細明體" w:hint="eastAsia"/>
+                <w:lang w:eastAsia="zh-TW"/>
+              </w:rPr>
+            </w:pPr>
+            <w:r>
+              <w:rPr>
+                <w:rFonts w:eastAsia="新細明體" w:hint="eastAsia"/>
+                <w:lang w:eastAsia="zh-TW"/>
+              </w:rPr>
+              <w:t>Jake</w:t>
+            </w:r>
+          </w:p>
         </w:tc>
       </w:tr>
     </w:tbl>
@@ -246,15 +287,7 @@
           </w:tcPr>
           <w:p>
             <w:r>
-              <w:t xml:space="preserve">Ocean Navy </w:t>
-            </w:r>
-            <w:proofErr w:type="gramStart"/>
-            <w:r>
-              <w:t>Blue (#</w:t>
-            </w:r>
-            <w:proofErr w:type="gramEnd"/>
-            <w:r>
-              <w:t>003366)</w:t>
+              <w:t>Ocean Navy Blue (#003366)</w:t>
             </w:r>
           </w:p>
           <w:p/>
@@ -287,19 +320,8 @@
           <w:p/>
           <w:p>
             <w:r>
-              <w:t xml:space="preserve">This application serves recreational scuba divers and dive shops by providing a safety-focused </w:t>
-            </w:r>
-            <w:proofErr w:type="gramStart"/>
-            <w:r>
-              <w:t>dive</w:t>
-            </w:r>
-            <w:proofErr w:type="gramEnd"/>
-            <w:r>
-              <w:t xml:space="preserve"> planning and air consumption estimation system. Scuba diving safety relies heavily on </w:t>
-            </w:r>
-            <w:r>
               <w:lastRenderedPageBreak/>
-              <w:t>predicting how much breathing gas a diver will consume based on water pressure, duration, and personal physiological traits. However, beginner divers often lack historical air consumption logs, making pre-dive planning uncertain and potentially dangerous.</w:t>
+              <w:t>This application serves recreational scuba divers and dive shops by providing a safety-focused dive planning and air consumption estimation system. Scuba diving safety relies heavily on predicting how much breathing gas a diver will consume based on water pressure, duration, and personal physiological traits. However, beginner divers often lack historical air consumption logs, making pre-dive planning uncertain and potentially dangerous.</w:t>
             </w:r>
           </w:p>
           <w:p>
@@ -382,11 +404,9 @@
             <w:tcW w:w="2358" w:type="dxa"/>
           </w:tcPr>
           <w:p>
-            <w:proofErr w:type="spellStart"/>
             <w:r>
               <w:t>diverName</w:t>
             </w:r>
-            <w:proofErr w:type="spellEnd"/>
           </w:p>
         </w:tc>
         <w:tc>
@@ -416,11 +436,9 @@
             <w:tcW w:w="2358" w:type="dxa"/>
           </w:tcPr>
           <w:p>
-            <w:proofErr w:type="spellStart"/>
             <w:r>
               <w:t>heightCm</w:t>
             </w:r>
-            <w:proofErr w:type="spellEnd"/>
           </w:p>
         </w:tc>
         <w:tc>
@@ -450,11 +468,9 @@
             <w:tcW w:w="2358" w:type="dxa"/>
           </w:tcPr>
           <w:p>
-            <w:proofErr w:type="spellStart"/>
             <w:r>
               <w:t>weightKg</w:t>
             </w:r>
-            <w:proofErr w:type="spellEnd"/>
           </w:p>
         </w:tc>
         <w:tc>
@@ -516,11 +532,9 @@
             <w:tcW w:w="2358" w:type="dxa"/>
           </w:tcPr>
           <w:p>
-            <w:proofErr w:type="spellStart"/>
             <w:r>
               <w:t>ageGroup</w:t>
             </w:r>
-            <w:proofErr w:type="spellEnd"/>
           </w:p>
         </w:tc>
         <w:tc>
@@ -550,11 +564,9 @@
             <w:tcW w:w="2358" w:type="dxa"/>
           </w:tcPr>
           <w:p>
-            <w:proofErr w:type="spellStart"/>
             <w:r>
               <w:t>targetDepthMeters</w:t>
             </w:r>
-            <w:proofErr w:type="spellEnd"/>
           </w:p>
         </w:tc>
         <w:tc>
@@ -584,11 +596,9 @@
             <w:tcW w:w="2358" w:type="dxa"/>
           </w:tcPr>
           <w:p>
-            <w:proofErr w:type="spellStart"/>
             <w:r>
               <w:t>plannedTimeMinutes</w:t>
             </w:r>
-            <w:proofErr w:type="spellEnd"/>
           </w:p>
         </w:tc>
         <w:tc>
@@ -618,11 +628,9 @@
             <w:tcW w:w="2358" w:type="dxa"/>
           </w:tcPr>
           <w:p>
-            <w:proofErr w:type="spellStart"/>
             <w:r>
               <w:t>diveScenario</w:t>
             </w:r>
-            <w:proofErr w:type="spellEnd"/>
           </w:p>
         </w:tc>
         <w:tc>
@@ -728,7 +736,6 @@
               </w:numPr>
               <w:spacing w:line="480" w:lineRule="auto"/>
             </w:pPr>
-            <w:proofErr w:type="spellStart"/>
             <m:oMath>
               <m:r>
                 <m:rPr>
@@ -736,7 +743,6 @@
                 </m:rPr>
                 <m:t>bsa</m:t>
               </m:r>
-              <w:proofErr w:type="spellEnd"/>
               <m:r>
                 <w:rPr>
                   <w:rFonts w:ascii="Cambria Math" w:hAnsi="Cambria Math"/>
@@ -767,14 +773,12 @@
                       </m:ctrlPr>
                     </m:dPr>
                     <m:e>
-                      <w:proofErr w:type="spellStart"/>
                       <m:r>
                         <m:rPr>
                           <m:nor/>
                         </m:rPr>
                         <m:t>heightCm</m:t>
                       </m:r>
-                      <w:proofErr w:type="spellEnd"/>
                       <m:r>
                         <w:rPr>
                           <w:rFonts w:ascii="Cambria Math" w:hAnsi="Cambria Math"/>
@@ -817,7 +821,6 @@
               </w:numPr>
               <w:spacing w:line="480" w:lineRule="auto"/>
             </w:pPr>
-            <w:proofErr w:type="spellStart"/>
             <m:oMath>
               <m:r>
                 <m:rPr>
@@ -825,7 +828,6 @@
                 </m:rPr>
                 <m:t>genderFactor</m:t>
               </m:r>
-              <w:proofErr w:type="spellEnd"/>
               <m:r>
                 <w:rPr>
                   <w:rFonts w:ascii="Cambria Math" w:hAnsi="Cambria Math"/>
@@ -877,7 +879,6 @@
               </w:numPr>
               <w:spacing w:line="480" w:lineRule="auto"/>
             </w:pPr>
-            <w:proofErr w:type="spellStart"/>
             <m:oMath>
               <m:r>
                 <m:rPr>
@@ -885,7 +886,6 @@
                 </m:rPr>
                 <m:t>ageMultiplier</m:t>
               </m:r>
-              <w:proofErr w:type="spellEnd"/>
               <m:r>
                 <w:rPr>
                   <w:rFonts w:ascii="Cambria Math" w:hAnsi="Cambria Math"/>
@@ -956,15 +956,14 @@
               </w:numPr>
               <w:spacing w:line="480" w:lineRule="auto"/>
             </w:pPr>
-            <w:proofErr w:type="spellStart"/>
             <m:oMath>
               <m:r>
                 <m:rPr>
                   <m:nor/>
                 </m:rPr>
+                <w:lastRenderedPageBreak/>
                 <m:t>baselineSAC</m:t>
               </m:r>
-              <w:proofErr w:type="spellEnd"/>
               <m:r>
                 <w:rPr>
                   <w:rFonts w:ascii="Cambria Math" w:hAnsi="Cambria Math"/>
@@ -1012,7 +1011,6 @@
                 <w:b/>
                 <w:bCs/>
               </w:rPr>
-              <w:lastRenderedPageBreak/>
               <w:t>Step 2: Calculate Effective SAC &amp; Air Volume at Depth</w:t>
             </w:r>
           </w:p>
@@ -1024,7 +1022,6 @@
               </w:numPr>
               <w:spacing w:line="480" w:lineRule="auto"/>
             </w:pPr>
-            <w:proofErr w:type="spellStart"/>
             <m:oMath>
               <m:r>
                 <m:rPr>
@@ -1032,7 +1029,6 @@
                 </m:rPr>
                 <m:t>ata</m:t>
               </m:r>
-              <w:proofErr w:type="spellEnd"/>
               <m:r>
                 <w:rPr>
                   <w:rFonts w:ascii="Cambria Math" w:hAnsi="Cambria Math"/>
@@ -1078,7 +1074,6 @@
               </w:numPr>
               <w:spacing w:line="480" w:lineRule="auto"/>
             </w:pPr>
-            <w:proofErr w:type="spellStart"/>
             <m:oMath>
               <m:r>
                 <m:rPr>
@@ -1086,7 +1081,6 @@
                 </m:rPr>
                 <m:t>effectiveSAC</m:t>
               </m:r>
-              <w:proofErr w:type="spellEnd"/>
               <m:r>
                 <w:rPr>
                   <w:rFonts w:ascii="Cambria Math" w:hAnsi="Cambria Math"/>
@@ -1121,7 +1115,6 @@
               </w:numPr>
               <w:spacing w:line="480" w:lineRule="auto"/>
             </w:pPr>
-            <w:proofErr w:type="spellStart"/>
             <m:oMath>
               <m:r>
                 <m:rPr>
@@ -1129,7 +1122,6 @@
                 </m:rPr>
                 <m:t>totalAirNeededLiters</m:t>
               </m:r>
-              <w:proofErr w:type="spellEnd"/>
               <m:r>
                 <w:rPr>
                   <w:rFonts w:ascii="Cambria Math" w:hAnsi="Cambria Math"/>
@@ -1200,7 +1192,6 @@
               </w:numPr>
               <w:spacing w:line="480" w:lineRule="auto"/>
             </w:pPr>
-            <w:proofErr w:type="spellStart"/>
             <m:oMath>
               <m:r>
                 <m:rPr>
@@ -1208,7 +1199,6 @@
                 </m:rPr>
                 <m:t>recommendedTankSizeLiters</m:t>
               </m:r>
-              <w:proofErr w:type="spellEnd"/>
               <m:r>
                 <w:rPr>
                   <w:rFonts w:ascii="Cambria Math" w:hAnsi="Cambria Math"/>
@@ -1248,23 +1238,7 @@
     </w:p>
     <w:p>
       <w:r>
-        <w:t xml:space="preserve">Once the document is completed, move the </w:t>
-      </w:r>
-      <w:proofErr w:type="gramStart"/>
-      <w:r>
-        <w:t>details</w:t>
-      </w:r>
-      <w:proofErr w:type="gramEnd"/>
-      <w:r>
-        <w:t xml:space="preserve"> a repository that you create.  The developer creates the repository for the topic that they will be coding.  Add the other two project group members to the </w:t>
-      </w:r>
-      <w:proofErr w:type="gramStart"/>
-      <w:r>
-        <w:t>repository(</w:t>
-      </w:r>
-      <w:proofErr w:type="gramEnd"/>
-      <w:r>
-        <w:t xml:space="preserve">or make public).  Add this document to the repository (Commit/Push).  </w:t>
+        <w:t xml:space="preserve">Once the document is completed, move the details a repository that you create.  The developer creates the repository for the topic that they will be coding.  Add the other two project group members to the repository(or make public).  Add this document to the repository (Commit/Push).  </w:t>
       </w:r>
       <w:r>
         <w:t>The description is to be added to the readme file of the repository.</w:t>

</xml_diff>